<commit_message>
feat: group materials, solvents and the diagram per step in reports
</commit_message>
<xml_diff>
--- a/lib/template/Standard.docx
+++ b/lib/template/Standard.docx
@@ -1469,21 +1469,21 @@
       </w:tr>
     </w:tbl>
     <w:p>
-      <w:pPr>
-        <w:rPr>
-          <w:rFonts w:ascii="Arial" w:hAnsi="Arial" w:cs="Arial"/>
-          <w:noProof/>
+      <w:r>
+        <w:rPr>
+          <w:rFonts w:ascii="Arial" w:hAnsi="Arial" w:cs="Arial"/>
           <w:sz w:val="18"/>
           <w:szCs w:val="18"/>
         </w:rPr>
-      </w:pPr>
+        <w:fldChar w:fldCharType="begin"/>
+      </w:r>
       <w:r>
         <w:rPr>
           <w:rFonts w:ascii="Arial" w:hAnsi="Arial" w:cs="Arial"/>
           <w:sz w:val="18"/>
           <w:szCs w:val="18"/>
         </w:rPr>
-        <w:br/>
+        <w:instrText xml:space="preserve"> MERGEFIELD  obj.steps:each(step)  \* MERGEFORMAT </w:instrText>
       </w:r>
       <w:r>
         <w:rPr>
@@ -1491,7 +1491,7 @@
           <w:sz w:val="18"/>
           <w:szCs w:val="18"/>
         </w:rPr>
-        <w:fldChar w:fldCharType="begin"/>
+        <w:fldChar w:fldCharType="separate"/>
       </w:r>
       <w:r>
         <w:rPr>
@@ -1499,7 +1499,7 @@
           <w:sz w:val="18"/>
           <w:szCs w:val="18"/>
         </w:rPr>
-        <w:instrText xml:space="preserve"> MERGEFIELD  obj.starting_materials:each(s)  \* MERGEFORMAT </w:instrText>
+        <w:t>«obj.steps:each(step)»</w:t>
       </w:r>
       <w:r>
         <w:rPr>
@@ -1507,16 +1507,194 @@
           <w:sz w:val="18"/>
           <w:szCs w:val="18"/>
         </w:rPr>
-        <w:fldChar w:fldCharType="separate"/>
-      </w:r>
-      <w:r>
-        <w:rPr>
-          <w:rFonts w:ascii="Arial" w:hAnsi="Arial" w:cs="Arial"/>
-          <w:noProof/>
+        <w:fldChar w:fldCharType="end"/>
+      </w:r>
+    </w:p>
+    <w:p>
+      <w:r>
+        <w:rPr>
+          <w:rFonts w:ascii="Arial" w:hAnsi="Arial" w:cs="Arial"/>
           <w:sz w:val="18"/>
           <w:szCs w:val="18"/>
         </w:rPr>
-        <w:t>«obj.starting_materials:each(s)»</w:t>
+        <w:fldChar w:fldCharType="begin"/>
+      </w:r>
+      <w:r>
+        <w:rPr>
+          <w:rFonts w:ascii="Arial" w:hAnsi="Arial" w:cs="Arial"/>
+          <w:sz w:val="18"/>
+          <w:szCs w:val="18"/>
+        </w:rPr>
+        <w:instrText xml:space="preserve"> MERGEFIELD  step.title:if  \* MERGEFORMAT </w:instrText>
+      </w:r>
+      <w:r>
+        <w:rPr>
+          <w:rFonts w:ascii="Arial" w:hAnsi="Arial" w:cs="Arial"/>
+          <w:sz w:val="18"/>
+          <w:szCs w:val="18"/>
+        </w:rPr>
+        <w:fldChar w:fldCharType="separate"/>
+      </w:r>
+      <w:r>
+        <w:rPr>
+          <w:rFonts w:ascii="Arial" w:hAnsi="Arial" w:cs="Arial"/>
+          <w:sz w:val="18"/>
+          <w:szCs w:val="18"/>
+        </w:rPr>
+        <w:t>«step.title:if»</w:t>
+      </w:r>
+      <w:r>
+        <w:rPr>
+          <w:rFonts w:ascii="Arial" w:hAnsi="Arial" w:cs="Arial"/>
+          <w:sz w:val="18"/>
+          <w:szCs w:val="18"/>
+        </w:rPr>
+        <w:fldChar w:fldCharType="end"/>
+      </w:r>
+    </w:p>
+    <w:p>
+      <w:r>
+        <w:rPr>
+          <w:rFonts w:ascii="Arial" w:hAnsi="Arial" w:cs="Arial"/>
+          <w:b/>
+          <w:bCs/>
+          <w:sz w:val="20"/>
+          <w:szCs w:val="20"/>
+        </w:rPr>
+        <w:fldChar w:fldCharType="begin"/>
+      </w:r>
+      <w:r>
+        <w:rPr>
+          <w:rFonts w:ascii="Arial" w:hAnsi="Arial" w:cs="Arial"/>
+          <w:b/>
+          <w:bCs/>
+          <w:sz w:val="20"/>
+          <w:szCs w:val="20"/>
+        </w:rPr>
+        <w:instrText xml:space="preserve"> MERGEFIELD  =step.title  \* MERGEFORMAT </w:instrText>
+      </w:r>
+      <w:r>
+        <w:rPr>
+          <w:rFonts w:ascii="Arial" w:hAnsi="Arial" w:cs="Arial"/>
+          <w:b/>
+          <w:bCs/>
+          <w:sz w:val="20"/>
+          <w:szCs w:val="20"/>
+        </w:rPr>
+        <w:fldChar w:fldCharType="separate"/>
+      </w:r>
+      <w:r>
+        <w:rPr>
+          <w:rFonts w:ascii="Arial" w:hAnsi="Arial" w:cs="Arial"/>
+          <w:b/>
+          <w:bCs/>
+          <w:sz w:val="20"/>
+          <w:szCs w:val="20"/>
+        </w:rPr>
+        <w:t>«=step.title»</w:t>
+      </w:r>
+      <w:r>
+        <w:rPr>
+          <w:rFonts w:ascii="Arial" w:hAnsi="Arial" w:cs="Arial"/>
+          <w:b/>
+          <w:bCs/>
+          <w:sz w:val="20"/>
+          <w:szCs w:val="20"/>
+        </w:rPr>
+        <w:fldChar w:fldCharType="end"/>
+      </w:r>
+    </w:p>
+    <w:p>
+      <w:r>
+        <w:rPr>
+          <w:rFonts w:ascii="Arial" w:hAnsi="Arial" w:cs="Arial"/>
+          <w:sz w:val="18"/>
+          <w:szCs w:val="18"/>
+        </w:rPr>
+        <w:fldChar w:fldCharType="begin"/>
+      </w:r>
+      <w:r>
+        <w:rPr>
+          <w:rFonts w:ascii="Arial" w:hAnsi="Arial" w:cs="Arial"/>
+          <w:sz w:val="18"/>
+          <w:szCs w:val="18"/>
+        </w:rPr>
+        <w:instrText xml:space="preserve"> MERGEFIELD  step.title:endIf  \* MERGEFORMAT </w:instrText>
+      </w:r>
+      <w:r>
+        <w:rPr>
+          <w:rFonts w:ascii="Arial" w:hAnsi="Arial" w:cs="Arial"/>
+          <w:sz w:val="18"/>
+          <w:szCs w:val="18"/>
+        </w:rPr>
+        <w:fldChar w:fldCharType="separate"/>
+      </w:r>
+      <w:r>
+        <w:rPr>
+          <w:rFonts w:ascii="Arial" w:hAnsi="Arial" w:cs="Arial"/>
+          <w:sz w:val="18"/>
+          <w:szCs w:val="18"/>
+        </w:rPr>
+        <w:t>«step.title:endIf»</w:t>
+      </w:r>
+      <w:r>
+        <w:rPr>
+          <w:rFonts w:ascii="Arial" w:hAnsi="Arial" w:cs="Arial"/>
+          <w:sz w:val="18"/>
+          <w:szCs w:val="18"/>
+        </w:rPr>
+        <w:fldChar w:fldCharType="end"/>
+      </w:r>
+    </w:p>
+    <w:p>
+      <w:pPr>
+        <w:rPr>
+          <w:rFonts w:ascii="Arial" w:hAnsi="Arial" w:cs="Arial"/>
+          <w:noProof/>
+          <w:sz w:val="18"/>
+          <w:szCs w:val="18"/>
+        </w:rPr>
+      </w:pPr>
+      <w:r>
+        <w:rPr>
+          <w:rFonts w:ascii="Arial" w:hAnsi="Arial" w:cs="Arial"/>
+          <w:sz w:val="18"/>
+          <w:szCs w:val="18"/>
+        </w:rPr>
+        <w:br/>
+      </w:r>
+      <w:r>
+        <w:rPr>
+          <w:rFonts w:ascii="Arial" w:hAnsi="Arial" w:cs="Arial"/>
+          <w:sz w:val="18"/>
+          <w:szCs w:val="18"/>
+        </w:rPr>
+        <w:fldChar w:fldCharType="begin"/>
+      </w:r>
+      <w:r>
+        <w:rPr>
+          <w:rFonts w:ascii="Arial" w:hAnsi="Arial" w:cs="Arial"/>
+          <w:sz w:val="18"/>
+          <w:szCs w:val="18"/>
+        </w:rPr>
+        <w:instrText xml:space="preserve"> MERGEFIELD  step.starting_materials:each(s)  \* MERGEFORMAT </w:instrText>
+      </w:r>
+      <w:r>
+        <w:rPr>
+          <w:rFonts w:ascii="Arial" w:hAnsi="Arial" w:cs="Arial"/>
+          <w:sz w:val="18"/>
+          <w:szCs w:val="18"/>
+        </w:rPr>
+        <w:fldChar w:fldCharType="separate"/>
+      </w:r>
+      <w:r>
+        <w:rPr>
+          <w:rFonts w:ascii="Arial" w:hAnsi="Arial" w:cs="Arial"/>
+          <w:noProof/>
+          <w:sz w:val="18"/>
+          <w:szCs w:val="18"/>
+        </w:rPr>
+        <w:t>«step.starting_materials:each(s)»</w:t>
       </w:r>
       <w:r>
         <w:rPr>
@@ -3511,7 +3689,7 @@
           <w:sz w:val="18"/>
           <w:szCs w:val="18"/>
         </w:rPr>
-        <w:instrText xml:space="preserve"> MERGEFIELD  obj.starting_materials:endEach  \* MERGEFORMAT </w:instrText>
+        <w:instrText xml:space="preserve"> MERGEFIELD  step.starting_materials:endEach  \* MERGEFORMAT </w:instrText>
       </w:r>
       <w:r>
         <w:rPr>
@@ -3528,7 +3706,7 @@
           <w:sz w:val="18"/>
           <w:szCs w:val="18"/>
         </w:rPr>
-        <w:t>«obj.starting_materials:endEach»</w:t>
+        <w:t>«step.starting_materials:endEach»</w:t>
       </w:r>
       <w:r>
         <w:rPr>
@@ -3562,7 +3740,7 @@
           <w:sz w:val="18"/>
           <w:szCs w:val="18"/>
         </w:rPr>
-        <w:instrText xml:space="preserve"> MERGEFIELD  obj.reactants:each(r)  \* MERGEFORMAT </w:instrText>
+        <w:instrText xml:space="preserve"> MERGEFIELD  step.reactants:each(r)  \* MERGEFORMAT </w:instrText>
       </w:r>
       <w:r>
         <w:rPr>
@@ -3579,7 +3757,7 @@
           <w:sz w:val="18"/>
           <w:szCs w:val="18"/>
         </w:rPr>
-        <w:t>«obj.reactants:each(r)»</w:t>
+        <w:t>«step.reactants:each(r)»</w:t>
       </w:r>
       <w:r>
         <w:rPr>
@@ -5609,7 +5787,7 @@
           <w:sz w:val="18"/>
           <w:szCs w:val="18"/>
         </w:rPr>
-        <w:instrText xml:space="preserve"> MERGEFIELD  obj.reactants:endEach  \* MERGEFORMAT </w:instrText>
+        <w:instrText xml:space="preserve"> MERGEFIELD  step.reactants:endEach  \* MERGEFORMAT </w:instrText>
       </w:r>
       <w:r>
         <w:rPr>
@@ -5626,7 +5804,7 @@
           <w:sz w:val="18"/>
           <w:szCs w:val="18"/>
         </w:rPr>
-        <w:t>«obj.reactants:endEach»</w:t>
+        <w:t>«step.reactants:endEach»</w:t>
       </w:r>
       <w:r>
         <w:rPr>
@@ -5660,7 +5838,7 @@
           <w:sz w:val="18"/>
           <w:szCs w:val="18"/>
         </w:rPr>
-        <w:instrText xml:space="preserve"> MERGEFIELD  obj.products:each(p)  \* MERGEFORMAT </w:instrText>
+        <w:instrText xml:space="preserve"> MERGEFIELD  step.products:each(p)  \* MERGEFORMAT </w:instrText>
       </w:r>
       <w:r>
         <w:rPr>
@@ -5677,7 +5855,7 @@
           <w:sz w:val="18"/>
           <w:szCs w:val="18"/>
         </w:rPr>
-        <w:t>«obj.products:each(p)»</w:t>
+        <w:t>«step.products:each(p)»</w:t>
       </w:r>
       <w:r>
         <w:rPr>
@@ -7445,7 +7623,7 @@
           <w:sz w:val="18"/>
           <w:szCs w:val="18"/>
         </w:rPr>
-        <w:instrText xml:space="preserve"> MERGEFIELD  obj.products:endEach  \* MERGEFORMAT </w:instrText>
+        <w:instrText xml:space="preserve"> MERGEFIELD  step.products:endEach  \* MERGEFORMAT </w:instrText>
       </w:r>
       <w:r>
         <w:rPr>
@@ -7462,7 +7640,7 @@
           <w:sz w:val="18"/>
           <w:szCs w:val="18"/>
         </w:rPr>
-        <w:t>«obj.products:endEach»</w:t>
+        <w:t>«step.products:endEach»</w:t>
       </w:r>
       <w:r>
         <w:rPr>
@@ -7587,7 +7765,7 @@
           <w:sz w:val="20"/>
           <w:szCs w:val="20"/>
         </w:rPr>
-        <w:instrText xml:space="preserve"> MERGEFIELD  obj.solvents:if  \* MERGEFORMAT </w:instrText>
+        <w:instrText xml:space="preserve"> MERGEFIELD  step.solvents:if  \* MERGEFORMAT </w:instrText>
       </w:r>
       <w:r>
         <w:rPr>
@@ -7605,7 +7783,7 @@
           <w:sz w:val="20"/>
           <w:szCs w:val="20"/>
         </w:rPr>
-        <w:t>«obj.solvents:if»</w:t>
+        <w:t>«step.solvents:if»</w:t>
       </w:r>
       <w:r>
         <w:rPr>
@@ -7660,7 +7838,7 @@
           <w:sz w:val="20"/>
           <w:szCs w:val="20"/>
         </w:rPr>
-        <w:instrText xml:space="preserve"> MERGEFIELD  =obj.solvents  \* MERGEFORMAT </w:instrText>
+        <w:instrText xml:space="preserve"> MERGEFIELD  =step.solvents  \* MERGEFORMAT </w:instrText>
       </w:r>
       <w:r>
         <w:rPr>
@@ -7678,7 +7856,7 @@
           <w:sz w:val="20"/>
           <w:szCs w:val="20"/>
         </w:rPr>
-        <w:t>«=obj.solvents»</w:t>
+        <w:t>«=step.solvents»</w:t>
       </w:r>
       <w:r>
         <w:rPr>
@@ -7716,7 +7894,7 @@
           <w:sz w:val="20"/>
           <w:szCs w:val="20"/>
         </w:rPr>
-        <w:instrText xml:space="preserve"> MERGEFIELD  obj.solvents:endIf  \* MERGEFORMAT </w:instrText>
+        <w:instrText xml:space="preserve"> MERGEFIELD  step.solvents:endIf  \* MERGEFORMAT </w:instrText>
       </w:r>
       <w:r>
         <w:rPr>
@@ -7734,14 +7912,56 @@
           <w:sz w:val="20"/>
           <w:szCs w:val="20"/>
         </w:rPr>
-        <w:t>«obj.solvents:endIf»</w:t>
-      </w:r>
-      <w:r>
-        <w:rPr>
-          <w:rFonts w:ascii="Arial" w:hAnsi="Arial" w:cs="Arial"/>
-          <w:noProof/>
-          <w:sz w:val="20"/>
-          <w:szCs w:val="20"/>
+        <w:t>«step.solvents:endIf»</w:t>
+      </w:r>
+      <w:r>
+        <w:rPr>
+          <w:rFonts w:ascii="Arial" w:hAnsi="Arial" w:cs="Arial"/>
+          <w:noProof/>
+          <w:sz w:val="20"/>
+          <w:szCs w:val="20"/>
+        </w:rPr>
+        <w:fldChar w:fldCharType="end"/>
+      </w:r>
+    </w:p>
+    <w:p>
+      <w:r>
+        <w:rPr>
+          <w:rFonts w:ascii="Arial" w:hAnsi="Arial" w:cs="Arial"/>
+          <w:sz w:val="18"/>
+          <w:szCs w:val="18"/>
+        </w:rPr>
+        <w:fldChar w:fldCharType="begin"/>
+      </w:r>
+      <w:r>
+        <w:rPr>
+          <w:rFonts w:ascii="Arial" w:hAnsi="Arial" w:cs="Arial"/>
+          <w:sz w:val="18"/>
+          <w:szCs w:val="18"/>
+        </w:rPr>
+        <w:instrText xml:space="preserve"> MERGEFIELD  obj.steps:endEach  \* MERGEFORMAT </w:instrText>
+      </w:r>
+      <w:r>
+        <w:rPr>
+          <w:rFonts w:ascii="Arial" w:hAnsi="Arial" w:cs="Arial"/>
+          <w:sz w:val="18"/>
+          <w:szCs w:val="18"/>
+        </w:rPr>
+        <w:fldChar w:fldCharType="separate"/>
+      </w:r>
+      <w:r>
+        <w:rPr>
+          <w:rFonts w:ascii="Arial" w:hAnsi="Arial" w:cs="Arial"/>
+          <w:sz w:val="18"/>
+          <w:szCs w:val="18"/>
+        </w:rPr>
+        <w:t>«obj.steps:endEach»</w:t>
+      </w:r>
+      <w:r>
+        <w:rPr>
+          <w:rFonts w:ascii="Arial" w:hAnsi="Arial" w:cs="Arial"/>
+          <w:sz w:val="18"/>
+          <w:szCs w:val="18"/>
         </w:rPr>
         <w:fldChar w:fldCharType="end"/>
       </w:r>

</xml_diff>

<commit_message>
feat: show each step's text under its step and mark the intermediate in reports
</commit_message>
<xml_diff>
--- a/lib/template/Standard.docx
+++ b/lib/template/Standard.docx
@@ -7913,6 +7913,173 @@
           <w:szCs w:val="20"/>
         </w:rPr>
         <w:t>«step.solvents:endIf»</w:t>
+      </w:r>
+      <w:r>
+        <w:rPr>
+          <w:rFonts w:ascii="Arial" w:hAnsi="Arial" w:cs="Arial"/>
+          <w:noProof/>
+          <w:sz w:val="20"/>
+          <w:szCs w:val="20"/>
+        </w:rPr>
+        <w:fldChar w:fldCharType="end"/>
+      </w:r>
+    </w:p>
+    <w:p>
+      <w:pPr>
+        <w:rPr>
+          <w:rFonts w:ascii="Arial" w:hAnsi="Arial" w:cs="Arial"/>
+          <w:noProof/>
+          <w:sz w:val="20"/>
+          <w:szCs w:val="20"/>
+        </w:rPr>
+      </w:pPr>
+      <w:r>
+        <w:rPr>
+          <w:rFonts w:ascii="Arial" w:hAnsi="Arial" w:cs="Arial"/>
+          <w:noProof/>
+          <w:sz w:val="20"/>
+          <w:szCs w:val="20"/>
+        </w:rPr>
+        <w:fldChar w:fldCharType="begin"/>
+      </w:r>
+      <w:r>
+        <w:rPr>
+          <w:rFonts w:ascii="Arial" w:hAnsi="Arial" w:cs="Arial"/>
+          <w:noProof/>
+          <w:sz w:val="20"/>
+          <w:szCs w:val="20"/>
+        </w:rPr>
+        <w:instrText xml:space="preserve"> MERGEFIELD  step.description:if  \* MERGEFORMAT </w:instrText>
+      </w:r>
+      <w:r>
+        <w:rPr>
+          <w:rFonts w:ascii="Arial" w:hAnsi="Arial" w:cs="Arial"/>
+          <w:noProof/>
+          <w:sz w:val="20"/>
+          <w:szCs w:val="20"/>
+        </w:rPr>
+        <w:fldChar w:fldCharType="separate"/>
+      </w:r>
+      <w:r>
+        <w:rPr>
+          <w:rFonts w:ascii="Arial" w:hAnsi="Arial" w:cs="Arial"/>
+          <w:noProof/>
+          <w:sz w:val="20"/>
+          <w:szCs w:val="20"/>
+        </w:rPr>
+        <w:t>«step.description:if»</w:t>
+      </w:r>
+      <w:r>
+        <w:rPr>
+          <w:rFonts w:ascii="Arial" w:hAnsi="Arial" w:cs="Arial"/>
+          <w:noProof/>
+          <w:sz w:val="20"/>
+          <w:szCs w:val="20"/>
+        </w:rPr>
+        <w:fldChar w:fldCharType="end"/>
+      </w:r>
+    </w:p>
+    <w:p>
+      <w:pPr>
+        <w:ind w:left="142"/>
+        <w:rPr>
+          <w:rFonts w:ascii="Arial" w:hAnsi="Arial" w:cs="Arial"/>
+          <w:noProof/>
+          <w:sz w:val="20"/>
+          <w:szCs w:val="20"/>
+        </w:rPr>
+      </w:pPr>
+      <w:r>
+        <w:rPr>
+          <w:rFonts w:ascii="Arial" w:hAnsi="Arial" w:cs="Arial"/>
+          <w:noProof/>
+          <w:sz w:val="20"/>
+          <w:szCs w:val="20"/>
+        </w:rPr>
+        <w:fldChar w:fldCharType="begin"/>
+      </w:r>
+      <w:r>
+        <w:rPr>
+          <w:rFonts w:ascii="Arial" w:hAnsi="Arial" w:cs="Arial"/>
+          <w:noProof/>
+          <w:sz w:val="20"/>
+          <w:szCs w:val="20"/>
+        </w:rPr>
+        <w:instrText xml:space="preserve"> MERGEFIELD  =step.description  \* MERGEFORMAT </w:instrText>
+      </w:r>
+      <w:r>
+        <w:rPr>
+          <w:rFonts w:ascii="Arial" w:hAnsi="Arial" w:cs="Arial"/>
+          <w:noProof/>
+          <w:sz w:val="20"/>
+          <w:szCs w:val="20"/>
+        </w:rPr>
+        <w:fldChar w:fldCharType="separate"/>
+      </w:r>
+      <w:r>
+        <w:rPr>
+          <w:rFonts w:ascii="Arial" w:hAnsi="Arial" w:cs="Arial"/>
+          <w:noProof/>
+          <w:sz w:val="20"/>
+          <w:szCs w:val="20"/>
+        </w:rPr>
+        <w:t>«=step.description»</w:t>
+      </w:r>
+      <w:r>
+        <w:rPr>
+          <w:rFonts w:ascii="Arial" w:hAnsi="Arial" w:cs="Arial"/>
+          <w:noProof/>
+          <w:sz w:val="20"/>
+          <w:szCs w:val="20"/>
+        </w:rPr>
+        <w:fldChar w:fldCharType="end"/>
+      </w:r>
+    </w:p>
+    <w:p/>
+    <w:p>
+      <w:pPr>
+        <w:rPr>
+          <w:rFonts w:ascii="Arial" w:hAnsi="Arial" w:cs="Arial"/>
+          <w:noProof/>
+          <w:sz w:val="20"/>
+          <w:szCs w:val="20"/>
+        </w:rPr>
+      </w:pPr>
+      <w:r>
+        <w:rPr>
+          <w:rFonts w:ascii="Arial" w:hAnsi="Arial" w:cs="Arial"/>
+          <w:noProof/>
+          <w:sz w:val="20"/>
+          <w:szCs w:val="20"/>
+        </w:rPr>
+        <w:fldChar w:fldCharType="begin"/>
+      </w:r>
+      <w:r>
+        <w:rPr>
+          <w:rFonts w:ascii="Arial" w:hAnsi="Arial" w:cs="Arial"/>
+          <w:noProof/>
+          <w:sz w:val="20"/>
+          <w:szCs w:val="20"/>
+        </w:rPr>
+        <w:instrText xml:space="preserve"> MERGEFIELD  step.description:endIf  \* MERGEFORMAT </w:instrText>
+      </w:r>
+      <w:r>
+        <w:rPr>
+          <w:rFonts w:ascii="Arial" w:hAnsi="Arial" w:cs="Arial"/>
+          <w:noProof/>
+          <w:sz w:val="20"/>
+          <w:szCs w:val="20"/>
+        </w:rPr>
+        <w:fldChar w:fldCharType="separate"/>
+      </w:r>
+      <w:r>
+        <w:rPr>
+          <w:rFonts w:ascii="Arial" w:hAnsi="Arial" w:cs="Arial"/>
+          <w:noProof/>
+          <w:sz w:val="20"/>
+          <w:szCs w:val="20"/>
+        </w:rPr>
+        <w:t>«step.description:endIf»</w:t>
       </w:r>
       <w:r>
         <w:rPr>

</xml_diff>